<commit_message>
v14.2: FIX critical bug — remove garbage text prepended to docx
Bug: empty-BEFORE AK revisions (where AK added new paragraphs to v11) were
incorrectly applied via str.replace("", text) which prepends at position 0.
Result: ~30 paragraphs of SWOT/§4.6/§4.4 content concatenated into a single
3-page blob at the start of the deliverable, with no formatting.

Fix: added explicit `if not before.strip(): continue` guard in apply script.
Re-applied 254 AK polish edits + 15 manual misses + §4.7.3 enrichment
(Πρότ. 3 + Πρότ. 7) from clean v13 baseline.

Verification: docx now opens with proper "# Κεφάλαιο 4. Χανιά" heading,
parses 540 blocks including 1 h1 (was 0 before), 4,043,583 bytes.

🤖 Generated with [Claude Code](https://claude.com/claude-code)

Co-Authored-By: Claude Opus 4.7 (1M context) <noreply@anthropic.com>
</commit_message>
<xml_diff>
--- a/assets/downloads/04_ΧΑΝΙΑ_PILOT_REVIEW_v14.docx
+++ b/assets/downloads/04_ΧΑΝΙΑ_PILOT_REVIEW_v14.docx
@@ -4,10 +4,10 @@
   <w:body>
     <w:p>
       <w:pPr>
-        <w:jc w:val="both"/>
-      </w:pPr>
-      <w:r>
-        <w:t>Γεωπολιτικές, ενεργειακές και οικονομικές κρίσειςΤ11Η ερμηνεία αυτού του ευρήματος είναι ότι η Μύκονος έχει ήδη προσαρμοστεί, εδώ και αρκετά χρόνια, στη θεσμοποιημένη και εκτεταμένη παρουσία των βραχυχρόνιων μισθώσεων (STR), καθώς σημαντικό μέρος των τοπικών οικογενειακών ακινήτων είχε μετατραπεί ή εξαγοραστεί ήδη σε προγενέστερες φάσεις τουριστικής ανάπτυξης. Αντίθετα, τα Χανιά φαίνεται να βιώνουν ακόμη την «πρώτη γενιά» αυτής της στεγαστικής και κοινωνικής μετάβασης, με τους κατοίκους να παρακολουθούν σε πραγματικό χρόνο τη μετακίνηση συγγενών, φίλων και γειτόνων εκτός της τοπικής αγοράς κατοικίας.Η ζώνη υψηλότερου περιβαλλοντικού κινδύνου εντοπίζεται στη βόρεια παράκτια ζώνη, όπου συγκεντρώνεται το μεγαλύτερο μέρος της τουριστικής δραστηριότητας και της οικιστικής ανάπτυξης. Σε αυτό το πλαίσιο, η έντονη χωρική ανισορροπία μεταξύ βόρειας και νότιας Κρήτης (§ 4.3.3, Κενό 2) λειτουργεί ταυτόχρονα ως πηγή κινδύνου, αλλά και ως δυνητική ευκαιρία στρατηγικής διαφοροποίησης: μια περισσότερο ισόρροπη χωρική διάχυση της δραστηριότητας θα μπορούσε να αποσυμπιέσει τις περιοχές υψηλής συγκέντρωσης, χωρίς να απαιτείται αντίστοιχη αύξηση της συνολικής φέρουσας ικανότητας του προορισμού.Συνολικά, η ΠΕ Χανίων παρουσιάζει μια «μικτή» περιβαλλοντική εικόνα. Από τη μία πλευρά, καταγράφονται εξαιρετικά υψηλές επιδόσεις στην ποιότητα των υδάτων κολύμβησης (100% εξαιρετική ποιότητα, § 4.6.2) και σχετικά θετικές αξιολογήσεις των βασικών υποδομών διαχείρισης απορριμμάτων και αποχέτευσης (66–71%). Από την άλλη πλευρά, παρατηρείται αυξανόμενη πίεση σε τρεις κρίσιμες διαστάσεις: η ταχεία επέκταση της τεχνητής γης (+25,2% μέσα σε τέσσερα έτη), η ανοδική πορεία του δείκτη WEI+ (12,51 σε εθνικό επίπεδο) και η έντονη οικοδομική δραστηριότητα, με 575 νέες οικοδομικές άδειες το 2025.Στο σύνολο των 8.346 km² της Κρήτη για το 2022, η τεχνητή γη, δηλαδή οι αστικές, βιομηχανικές και οικιστικές χρήσεις καθώς και οι μεταφορικές υποδομές, καλύπτει 388 km² (4,65%). Αντίστοιχα, οι καλλιεργήσιμες εκτάσεις καταλαμβάνουν 2.386 km² (28,6%), τα δάση 1.551 km² (18,6%) και οι εκτάσεις θαμνώδους βλάστησης 3.428 km² (41,1%). Ο πλέον κρίσιμος δείκτης αφορά τη μεταβολή της τεχνητής γης: από 313 km² το 2009 αυξήθηκε σε 388 km² το 2022, καταγράφοντας συνολική αύξηση +24,0% μέσα σε δεκατρία χρόνια. Ιδιαίτερα έντονη είναι η επιτάχυνση κατά την τετραετία 2018–2022 (+25,2%, από 310 σε 388 km²), εξέλιξη που συμπίπτει χρονικά με την έκρηξη των οικοδομικών αδειών στην ΠΕ Χανίων (+224% την περίοδο 2015–2024, βλ. § 4.4.5). Παρότι το συνολικό ποσοστό τεχνητής γης (4,65%) παραμένει σχετικά χαμηλό σε σύγκριση με τον ευρωπαϊκό μέσο όρο (~6%), η δυναμική μεταβολής είναι σαφώς αυξητική και χωρικά άνισα κατανεμημένη. Ειδικότερα, η συγκέντρωση της ανάπτυξης στη βόρεια παράκτια ζώνη (στον άξονα Πλατανιάς–Χανιά–Σούδα) δημιουργεί τοπικές πιέσεις, που δεν αποτυπώνονται επαρκώς σε επίπεδο ανάλυσης NUTS2.Η επίδοση αυτή αντανακλά αφενός τα ιδιαίτερα φυσικά χαρακτηριστικά της περιοχής, όπως τα καθαρά ρεύματα που συνδέονται με τον ορεινό όγκο των Λευκών Ορέων και τη σχετικά περιορισμένη βιομηχανική δραστηριότητα, και αφετέρου την αποτελεσματικότητα των πρακτικών περιβαλλοντικής διαχείρισης και παρακολούθησης των ακτών.Η ποιότητα των υδάτων κολύμβησης αποτελεί ένα από τα ισχυρότερα συγκριτικά πλεονεκτήματα των Χανίων: το 100% των ακτών καταγράφει «εξαιρετική» ποιότητα υδάτων, επίδοση που αντιστοιχεί σε απόλυτο score και είναι μοναδική μεταξύ των δέκα εξεταζόμενων προορισμών (έναντι 96% στην Κέρκυρα). Παράλληλα, οι 43 ακτές με διάκριση Blue Flag αποτελούν τον υψηλότερο αριθμό μεταξύ των μελετώμενων προορισμών, σχεδόν τριπλάσιο από εκείνον της Κέρκυρας (16).Η αναγνώριση ενός επικείμενου «σημείου καμπής» από τα στελέχη του προορισμού εμφανίζεται συγκρίσιμης τάξης μεγέθους με το ποσοστό κοινωνικής «παραίτησης» (27% Ήπια Απάθεια), που καταγράφεται στην ποσοτική έρευνα. Η σύγκλιση αυτή μεταξύ ποιοτικών και ποσοτικών ευρημάτων είναι ιδιαίτερα σημαντική, καθώς υποδηλώνει ότι οι ίδιοι υποκείμενοι μηχανισμοί πίεσης και κόπωσης αναγνωρίζονται από διαφορετικά σημεία παρατήρησης (observation points), ενισχύοντας έτσι την αξιοπιστία της συνολικής διάγνωσης.Συμπερασματικά, η συνολική εικόνα δεν παραπέμπει ακόμη σε κατάσταση κοινωνικής κρίσης, ωστόσο οι καταγεγραμμένες τάσεις είναι σαφώς ανησυχητικές. Το παράθυρο πολιτικής παρέμβασης παραμένει ανοιχτό, αλλά φαίνεται να στενεύει σταδιακά.Συγκριτικά με τους υπόλοιπους προορισμούς, τα Χανιά καταγράφουν το τρίτο υψηλότερο ποσοστό «Αντιπαλότητας» (23%), μετά την Κέρκυρα (30%) και τη Μύκονο (21%). Παράλληλα, εμφανίζουν το υψηλότερο ποσοστό «Ήπιας Απάθειας» (27%) μεταξύ και των δέκα προορισμών, στοιχείο που μπορεί να ερμηνευθεί ως ένδειξη κοινωνικής κόπωσης ή σταδιακής παραίτησης απέναντι στις πιέσεις της τουριστικής ανάπτυξης.Η στρατηγική σταδιοποίηση κατά George Doxey για τα Χανιά δείχνει ότι ο προορισμός βρίσκεται σε μεταβατική φάση μεταξύ του τρίτου σταδίου (Annoyance) και του τέταρτου (Antagonism). Συγκεκριμένα, το 23% των κατοίκων εντάσσεται στην κατηγορία «Αντιπαλότητα», το 14,5% στη «Συγκρατημένη Ενόχληση» και το 27% στην «Ήπια Απάθεια», με αποτέλεσμα συνολικά το 64,5% των κατοίκων να κατατάσσεται σε αρνητικές ή κοινωνικά απομακρυσμένες στάσεις απέναντι στον τουρισμό.Η σχετικά ομοιογενής χρωματική κατανομή των επιμέρους δεικτών υποδηλώνει μια συνολικά θετική εμπειρία κατοίκησης υπό καθεστώς τουριστικής ανάπτυξης, με σαφή όμως εξαίρεση τη στέγαση. Υπό το πρίσμα της θεωρίας του George Doxey, τα Χανιά φαίνεται να μεταβαίνουν από τη φάση της «Apathy»,  όπου ο τουρισμός θεωρείται δεδομένο και ουδέτερο στοιχείο της τοπικής ζωής — προς τη φάση της «Annoyance», όπου αρχίζουν να διατυπώνονται συστηματικές αρνητικές αξιολογήσεις σε συγκεκριμένες διαστάσεις της καθημερινότητας. Η μετάβαση αυτή έχει ιδιαίτερη στρατηγική σημασία: εάν δεν αντιμετωπιστούν έγκαιρα οι βασικές πηγές κοινωνικής τριβής, και ιδίως το στεγαστικό πρόβλημα, ο προορισμός ενδέχεται να μετακινηθεί μέσα στην επόμενη 5ετία–10ετία προς τη φάση του «Antagonism», με δυνητικά σοβαρές οικονομικές, κοινωνικές και πολιτικές συνέπειες.Στις διαστάσεις πίεσης, όπως η συμφόρηση και ο θόρυβος, τα Χανιά εμφανίζουν ενδιάμεσες αξιολογήσεις (~3,3–3,5), που καταδεικνύουν αναγνώριση υπαρκτών πιέσεων, χωρίς όμως να παραπέμπουν ακόμη σε κατάσταση κρίσιμου κορεσμού. Η εντονότερα αρνητική αξιολόγηση αφορά σαφώς το στεγαστικό ζήτημα (3,05/5), το οποίο αποτελεί τη μοναδική διάσταση όπου ο τουρισμός εκλαμβάνεται κυρίως ως αρνητικός παράγοντας. Αν και η εικόνα αυτή παραμένει ηπιότερη σε σύγκριση με τη Μύκονος (2,2/5 στη στεγαστική διάσταση), η σύγκριση με το Ναύπλιο (3,8/5) και τον άξονα Βόλος–Πήλιο (3,9/5) δείχνει ότι τα Χανιά βρίσκονται ήδη σε δυσμενέστερη θέση από τους ηπειρωτικούς προορισμούς της έρευνας.Σε συνολική αποτίμηση, τα Χανιά συγκαταλέγονται μεταξύ των προορισμών με τις πιο θετικές κοινωνικές στάσεις απέναντι στον τουρισμό. Βασικά στοιχεία τοπικής ταυτότητας, όπως η φιλικότητα των κατοίκων και το αίσθημα ασφάλειας, αξιολογούνται ιδιαίτερα υψηλά (~4,1–4,2/5), γεγονός που υποδηλώνει ότι η τουριστική ανάπτυξη δεν έχει διαβρώσει τη θεμελιώδη κοινωνική συνοχή του προορισμού. Η εικόνα αυτή διαφοροποιείται αισθητά από την περίπτωση της Μυκόνου, όπου οι αντίστοιχες αξιολογήσεις είναι σημαντικά χαμηλότερες (3,7 και 3,4), αντανακλώντας υψηλότερο βαθμό εμπορικοποίησης και αποδυνάμωσης των τοπικών κοινωνικών δομών.Παράλληλα, οι στατιστικές αναλύσεις υπο-ομαδικών διαφοροποιήσεων (Παρ. Ζ, § Ζ.2) δείχνουν ότι στα Χανιά οι κάτοικοι με μεταπτυχιακή εκπαίδευση αναφέρουν 5–6 φορές συχνότερα, σε σύγκριση με αποφοίτους Λυκείου, ότι ο τουρισμός είναι ενοχλητικός ή έχει φτάσει σε κατάσταση κορεσμού. Το εύρημα αυτό επιβεβαιώνει ένα ευρύτερο διατομεακό συμπέρασμα της έρευνας: η εκπαίδευση αποτελεί τον ισχυρότερο ατομικό παράγοντα διαμόρφωσης αντίληψης της τουριστικής πίεσης (Παρ. Ζ, § Ζ.7).Στις ομάδες αυτές περιλαμβάνονται και εργαζόμενοι στον τουριστικό τομέα, στοιχείο που επιβεβαιώνει το αιτιακό εύρημα της § 4.4.3: οι τουριστικά απασχολούμενοι δεν λειτουργούν ως biased stakeholders, αλλά ως άμεσα εκτεθειμένοι και ενεργοί παρατηρητές των πιέσεων που παράγει η τουριστική ανάπτυξη. Στο πλαίσιο αυτό, έχουν ήδη καταγραφεί περιπτώσεις αποτελεσματικής κοινωνικής κινητοποίησης που οδήγησαν στην αναστολή ή αναθεώρηση επενδύσεων οι οποίες θεωρήθηκαν περιβαλλοντικά επιβαρυντικές, όπως στους Άγιοι Απόστολοι και στα Φαλάσαρνα.Η ποιοτική έρευνα προσθέτει μια κρίσιμη κοινωνική διάσταση στην ανάλυση. Η τοπική κοινωνία δεν εμφανίζεται ως εχθρική απέναντι στον τουρισμό καθαυτό, αλλά ως increasingly ευαισθητοποιημένη και διατεθειμένη να αντιδράσει απέναντι σε πρωτοβουλίες που θεωρεί ότι υποβαθμίζουν την ποιότητα ζωής ή επιβαρύνουν το φυσικό και οικιστικό περιβάλλον:Με χαμηλή αντιλαμβανόμενη φέρουσα ικανότητα (3,15 σε κλίμακα 1–5, κάτω από τη διάμεσο των δέκα προορισμών) και ταυτόχρονα μέτριο επίπεδο ικανοποίησης κατοίκων (3,61, κοντά στη διάμεσο), τα Χανιά τοποθετούνται οριακά στη ζώνη Crisis Zone του στρατηγικού τεταρτημορίου «Φέρουσα Ικανότητα × Ικανοποίηση». Η θέση αυτή υποδηλώνει ταυτόχρονη εμφάνιση πιέσεων τόσο ως προς την αντιλαμβανόμενη χωρητικότητα του προορισμού όσο και ως προς την κοινωνική αποδοχή του υφιστάμενου μοντέλου τουριστικής ανάπτυξης.Στρατηγική τοποθέτηση: Crisis Zone (Παρ. Η.1):Η τάση αυτή είναι ιδιαίτερα κρίσιμη για τη συνολική προσφορά καταλυμάτων και ειδικότερα για τη δυνητική προσφορά βραχυχρόνιων μισθώσεων (STR). Η αυξανόμενη παραγωγή κατοικιών μεγαλύτερης κλίμακας συνεπάγεται διαρκή διεύρυνση της διαθέσιμης δεξαμενής ακινήτων που μπορούν να μετατραπούν σε τουριστική χρήση, εκτός εάν εφαρμοστεί συνεκτική στεγαστική πολιτική που να διαφοροποιεί σαφώς τον σκοπό της κατασκευής (ιδιοκατοίκηση έναντι τουριστικής εκμετάλλευσης μέσω STR). Η § 4.7.2, Άξονας 3, αναπτύσσει αναλυτικότερα το συγκεκριμένο πλαίσιο πολιτικής.Η εξέλιξη των οικοδομικών αδειών αποτυπώνει το «επενδυτικό αντανακλαστικό» που προκαλεί η τουριστική ζήτηση στον δομημένο χώρο, αναδεικνύοντας τον τρόπο με τον οποίο οι προσδοκίες για τουριστική ανάπτυξη μεταφράζονται σε νέες κατασκευαστικές δραστηριότητες.Στο σημείο αυτό, δύο ερμηνείες είναι ιδιαίτερα κρίσιμες.Η ανάλυση IPW (Inverse Probability Weighting) + CEM (Coarsened Exact Matching) (Παρ. Ζ, § Ζ.8) δείχνει ότι, στους ώριμους τουριστικούς προορισμούς συνολικά, η απασχόληση στον τουρισμό αυξάνει αιτιακά την αντιληπτή τουριστική πίεση (POI θ̂) κατά +0,21 τυπικές αποκλίσεις (95% CI [+0,11, +0,31] με IPW και [+0,08, +0,32] με CEM), με σαφή μεθοδολογική σύγκλιση μεταξύ των δύο ανεξάρτητων προσεγγίσεων.Στα Χανιά, το 46,7% των κατοίκων είτε εργάζονται οι ίδιοι στον τουριστικό τομέα, είτε έχουν μέλος του νοικοκυριού τους που απασχολείται σε αυτόν. Το ποσοστό αυτό είναι το δεύτερο υψηλότερο μεταξύ των δέκα υπό εξέταση προορισμών, μετά την Κέρκυρα (61,6%), γεγονός που υπογραμμίζει τον ιδιαίτερα υψηλό βαθμό εξάρτησης της τοπικής οικονομίας από τον τουρισμό.Η έΩστόσο, οι ποιοτικές αναφορές δείχνουν ότι η διασύνδεση του τουρισμού με τον πρωτογενή τομέα παραμένει περιορισμένη. Όπως χαρακτηριστικά αναφέρεται, «ένας ξενοδόχος πρέπει να καταλάβει ότι, για να ενισχύσει την ταυτότητά του, θα πρέπει να χρησιμοποιεί τοπικά προϊόντα και τοπικές γεύσεις, γιατί αυτό θα ωφελήσει και τον τόπο μακροπρόθεσμα». Παρά τη δυναμική αυτή, επισημαίνεται, επίσης, ότι «τα ξενοδοχεία και η εστίαση δεν προτιμούν απαραίτητα τα τοπικά προϊόντα, καθώς είναι ακριβότερα», με αποτέλεσμα σημαντικό μέρος της παραγόμενης αξίας να μην παραμένει στην τοπική οικονομία.Η εστίαση αναδεικνύεται σε ιδιαίτερα ισχυρό υποκλάδο του τουριστικού τομέα: το 2023 καταγράφηκαν 1.073 μονάδες στον κωδικό NACE 561, με συνολικό κύκλο εργασιών 201,5 εκατ. €, μέγεθος σχεδόν 10% υψηλότερο από το αντίστοιχο της Κέρκυρας (184,3 εκατ. €). Η επίδοση αυτή αντανακλά σε σημαντικό βαθμό το premium positioning της κρητικής γαστρονομίας ως στοιχείου του τουριστικού προϊόντος.Τα δεδομένα προέρχονται από την Έρευνα Διάρθρωσης Επιχειρήσεων της ΕΛΣΤΑΤ (SBR01), και ειδικότερα από τον πίνακα T06 σε επίπεδο NUTS3 και τετραψήφιου κωδικού NACE. Βασική μεθοδολογική δυσκολία αποτελεί η δομική ασυνέχεια στη στατιστικά μετρήσιμη διάκριση μεταξύ των κωδικών I551 και I552: ορισμένες μονάδες βραχυχρόνιας μίσθωσης (STR) καταγράφονται ως I551, όταν λειτουργούν επίσημα ως «ενοικιαζόμενα δωμάτια», ενώ άλλες εντάσσονται στον κωδικό I552, ως μη θεσμοποιημένες μορφές βραχυχρόνιας μίσθωσης. Ως εκ τούτου, ο διαχωρισμός των δύο κωδικών αντανακλά περισσότερο τη διάκριση μεταξύ «οργανωμένου ξενοδοχειακού καταλύματος» και «ενοικιαζόμενων δωματίων» παρά μια αυστηρή διάκριση μεταξύ «ξενοδοχείων» και «καταλυμάτων τύπου Airbnb». Η αντιπαραβολή με τα δεδομένα της AirDNA (§ 4.2.4) επιτρέπει τη διασταύρωση και επιβεβαίωση των βασικών τάσεων που καταγράφονται.Δύο επιμέρους αξιολογήσεις διαφοροποιούν τη γενικά θετική αυτή εικόνα και παρουσιάζουν ιδιαίτερο ενδιαφέρον για περαιτέρω ανάλυση.Πίνακας;Η ανάλυση Σημαντικότητας–Απόδοσης (Importance–Performance Analysis) εντοπίζει 14 ζητήματα στην κατηγορία «Άμεσης Προτεραιότητας» για τα Χανιά (βλ. Παρ. ΣΤ, § ΣΤ.6.2.2), μεταξύ των οποίων η στάθμευση, το εθνικό και το τοπικό οδικό δίκτυο, καθώς και οι δομές υγείας. Οι τομείς αυτοί συγκροτούν την κορυφαία δέσμη προτεραιοτήτων πολιτικής για τη βελτίωση της κοινωνικής αποδοχής και στήριξης του τουρισμού.Σε επίπεδο ενδοκρητικού ανταγωνισμού, η σχέση των Χανίων με το Ηράκλειο, το Λασίθι (ιδίως την Ελούντα και τη Σητεία) και το Ρέθυμνο μετριάζεται τόσο από τη γεωγραφική απόσταση όσο και από τη διαφοροποίηση των αγορών που εξυπηρετεί κάθε προορισμός. Ενδεικτικά, το Ηράκλειο λειτουργεί κυρίως ως κόμβος της μαζικής τουριστικής αγοράς, το Λασίθι προσανατολίζεται περισσότερο στο luxury segment, ενώ τα Χανιά τοποθετούνται κυρίως στο μεσαίο-υψηλό experiential τμήμα της αγοράς. Ωστόσο, η ολοκλήρωση του νέου αεροδρομίου στο Καστέλι ενδέχεται να αναδιαμορφώσει την υφιστάμενη ισορροπία, ενισχύοντας αφενός τις συνολικές τουριστικές ροές προς την Κρήτη, αλλά αφετέρου και τον ανταγωνισμό μεταξύ των επιμέρους προορισμών του νησιού.Πίνακας;# Κεφάλαιο 4. Χανιά</w:t>
+        <w:pStyle w:val="Heading1"/>
+      </w:pPr>
+      <w:r>
+        <w:t>Κεφάλαιο 4. Χανιά</w:t>
       </w:r>
     </w:p>
     <w:p>

</xml_diff>